<commit_message>
Refine figure layouts and preserve PDF text spacing
</commit_message>
<xml_diff>
--- a/docs/manuscript/v7/OvCAN_Scientific_Data_draft_v7.docx
+++ b/docs/manuscript/v7/OvCAN_Scientific_Data_draft_v7.docx
@@ -6089,7 +6089,7 @@
       <w:r>
         <w:drawing>
           <wp:inline xmlns:a="http://schemas.openxmlformats.org/drawingml/2006/main" xmlns:pic="http://schemas.openxmlformats.org/drawingml/2006/picture">
-            <wp:extent cx="5943600" cy="4581525"/>
+            <wp:extent cx="5943600" cy="3302000"/>
             <wp:docPr id="1" name="Picture 1" descr="Figure 1. See the Figure legends section for a panel-by-panel description."/>
             <wp:cNvGraphicFramePr>
               <a:graphicFrameLocks noChangeAspect="1"/>
@@ -6110,7 +6110,7 @@
                   <pic:spPr>
                     <a:xfrm>
                       <a:off x="0" y="0"/>
-                      <a:ext cx="5943600" cy="4581525"/>
+                      <a:ext cx="5943600" cy="3302000"/>
                     </a:xfrm>
                     <a:prstGeom prst="rect"/>
                   </pic:spPr>

</xml_diff>